<commit_message>
Implemented cost-optimization features, splitting tasks by model and limiting input/output tokens.
</commit_message>
<xml_diff>
--- a/data/tailored_resumes/one-job-run/Boston_Dynamics_Head_of_Strategic_Programs__Busine_linkedin.docx
+++ b/data/tailored_resumes/one-job-run/Boston_Dynamics_Head_of_Strategic_Programs__Busine_linkedin.docx
@@ -69,7 +69,7 @@
           <w:rFonts w:ascii="Calibri" w:hAnsi="Calibri"/>
           <w:sz w:val="20"/>
         </w:rPr>
-        <w:t>Director-level program management executive with 8+ years leading cross-functional enterprise initiatives, PMO governance, and complex technology implementations across defense and commercial sectors.</w:t>
+        <w:t>Director-level program management leader with 8+ years scaling PMO operations, leading cross-functional enterprise programs, and building governance frameworks across defense, technology, and manufacturing environments.</w:t>
       </w:r>
     </w:p>
     <w:p>
@@ -125,7 +125,7 @@
           <w:rFonts w:ascii="Calibri" w:hAnsi="Calibri"/>
           <w:sz w:val="20"/>
         </w:rPr>
-        <w:t>•  Led cross-functional program management for submarine flight-critical hardware testing programs, managing team of 5 technicians and 3 junior engineers with full portfolio oversight</w:t>
+        <w:t>•  Led cross-functional program management for submarine flight-critical hardware testing programs, managing team of 5 technicians and 3 junior engineers with full accountability for deliverables and stakeholder coordination</w:t>
       </w:r>
     </w:p>
     <w:p>
@@ -138,7 +138,7 @@
           <w:rFonts w:ascii="Calibri" w:hAnsi="Calibri"/>
           <w:sz w:val="20"/>
         </w:rPr>
-        <w:t>•  Executed enterprise-scale program governance for Columbia-class submarine flight-critical hardware qualification, ensuring stakeholder alignment and MIL-STD compliance across complex initiatives</w:t>
+        <w:t>•  Executed enterprise-scale qualification testing program for Columbia-class submarine flight-critical hardware, ensuring governance compliance with MIL-STD requirements across complex multi-stakeholder environment</w:t>
       </w:r>
     </w:p>
     <w:p>
@@ -151,7 +151,7 @@
           <w:rFonts w:ascii="Calibri" w:hAnsi="Calibri"/>
           <w:sz w:val="20"/>
         </w:rPr>
-        <w:t>•  Drove business operations optimization initiatives identifying process improvements that delivered $2M cost savings to the US Navy through strategic program management</w:t>
+        <w:t>•  Designed and implemented process improvement initiatives saving the US Navy $2M in testing and qualification costs through operating model optimization and risk mitigation strategies</w:t>
       </w:r>
     </w:p>
     <w:p>
@@ -164,7 +164,7 @@
           <w:rFonts w:ascii="Calibri" w:hAnsi="Calibri"/>
           <w:sz w:val="20"/>
         </w:rPr>
-        <w:t>•  Received executive leadership commendation for program delivery excellence, designing and delivering hardware testbed Mk. IV ahead of schedule and under budget</w:t>
+        <w:t>•  Received executive leadership commendation for delivering hardware testbed Mk. IV program ahead of schedule and under budget through disciplined program management and stakeholder alignment</w:t>
       </w:r>
     </w:p>
     <w:p>
@@ -204,7 +204,7 @@
           <w:rFonts w:ascii="Calibri" w:hAnsi="Calibri"/>
           <w:sz w:val="20"/>
         </w:rPr>
-        <w:t>•  Led enterprise program management for $100M Army RADAR modernization program, coordinating cross-functional teams across next-generation phased array systems implementation</w:t>
+        <w:t>•  Led embedded software development portfolio for $100M Army RADAR modernization program, coordinating cross-functional execution across next-generation phased array systems with full program accountability</w:t>
       </w:r>
     </w:p>
     <w:p>
@@ -217,7 +217,7 @@
           <w:rFonts w:ascii="Calibri" w:hAnsi="Calibri"/>
           <w:sz w:val="20"/>
         </w:rPr>
-        <w:t>•  Architected enterprise technology platform bridging C++ firmware to Python data pipeline, enabling automated governance across 200+ test cases for program portfolio management</w:t>
+        <w:t>•  Architected hardware-in-the-loop test platform bridging C++ firmware to Python data pipeline, enabling automated regression testing across 200+ test cases through systematic process design</w:t>
       </w:r>
     </w:p>
     <w:p>
@@ -230,7 +230,7 @@
           <w:rFonts w:ascii="Calibri" w:hAnsi="Calibri"/>
           <w:sz w:val="20"/>
         </w:rPr>
-        <w:t>•  Successfully executed mission-critical program deployment to Reagan Test Site, Kwajalein Atoll, managing stakeholder communication and operational readiness in DoD environment</w:t>
+        <w:t>•  Successfully deployed software to Reagan Test Site, Kwajalein Atoll for mission-critical RADAR systems in operational DoD environment, ensuring governance compliance and stakeholder satisfaction</w:t>
       </w:r>
     </w:p>
     <w:p>
@@ -283,7 +283,7 @@
           <w:rFonts w:ascii="Calibri" w:hAnsi="Calibri"/>
           <w:sz w:val="20"/>
         </w:rPr>
-        <w:t>•  Built and managed cross-functional 3-person engineering team with zero turnover across 3+ years, demonstrating team leadership and change management capabilities</w:t>
+        <w:t>•  Built and scaled 3-person engineering team with zero turnover across 3+ years, establishing operating model, governance frameworks, and capability development processes for sustained organizational growth</w:t>
       </w:r>
     </w:p>
     <w:p>
@@ -296,7 +296,7 @@
           <w:rFonts w:ascii="Calibri" w:hAnsi="Calibri"/>
           <w:sz w:val="20"/>
         </w:rPr>
-        <w:t>•  Architected enterprise-scale AI platform Spyglass with OCR, NLP/LLM extraction, and orchestration pipeline, leading complex technology implementation from concept to deployment</w:t>
+        <w:t>•  Led end-to-end program management for Spyglass AI-native automated public-records researcher, coordinating cross-functional development of OCR, NLP/LLM extraction, and recursive orchestration pipeline</w:t>
       </w:r>
     </w:p>
     <w:p>
@@ -309,20 +309,7 @@
           <w:rFonts w:ascii="Calibri" w:hAnsi="Calibri"/>
           <w:sz w:val="20"/>
         </w:rPr>
-        <w:t>•  Executed business operations strategy acquiring 3 paying customers generating $300+ MRR while securing MIT Sandbox grant funding through stakeholder management</w:t>
-      </w:r>
-    </w:p>
-    <w:p>
-      <w:pPr>
-        <w:spacing w:before="0" w:after="0"/>
-        <w:ind w:left="360"/>
-      </w:pPr>
-      <w:r>
-        <w:rPr>
-          <w:rFonts w:ascii="Calibri" w:hAnsi="Calibri"/>
-          <w:sz w:val="20"/>
-        </w:rPr>
-        <w:t>•  Designed end-to-end OCR -&gt; NLP/LLM extraction -&gt; recursive orchestration pipeline processing thousands of public records with &lt;2% error rate</w:t>
+        <w:t>•  Designed enterprise-scale OCR to NLP/LLM extraction to recursive orchestration pipeline processing thousands of public records with &lt;2% error rate through systematic quality governance and risk management</w:t>
       </w:r>
     </w:p>
     <w:p>
@@ -362,7 +349,7 @@
           <w:rFonts w:ascii="Calibri" w:hAnsi="Calibri"/>
           <w:sz w:val="20"/>
         </w:rPr>
-        <w:t>•  Led cross-functional GTM strategy and technical requirements definition for EMR data product at Helium Health, managing international stakeholder integration in Nairobi</w:t>
+        <w:t>•  Led cross-functional GTM strategy and technical requirements definition for EMR data product at Helium Health, coordinating stakeholder integration across international operations in Nairobi</w:t>
       </w:r>
     </w:p>
     <w:p>
@@ -375,7 +362,7 @@
           <w:rFonts w:ascii="Calibri" w:hAnsi="Calibri"/>
           <w:sz w:val="20"/>
         </w:rPr>
-        <w:t>•  Built enterprise genAI analytics MVP detecting discrimination patterns across 10K+ court documents for ICAAD, leading program delivery for international human rights NGO</w:t>
+        <w:t>•  Built genAI analytics MVP detecting discrimination patterns across 10K+ court documents for ICAAD international human rights NGO, managing program delivery and stakeholder communication</w:t>
       </w:r>
     </w:p>
     <w:p>
@@ -431,7 +418,7 @@
           <w:rFonts w:ascii="Calibri" w:hAnsi="Calibri"/>
           <w:sz w:val="20"/>
         </w:rPr>
-        <w:t>•  Executive education in Finance and Entrepreneurship &amp; Innovation, building strategic business operations and portfolio management capabilities</w:t>
+        <w:t>•  GenAI Lab project lead, built LLM-powered analytics tools for enterprise research workflows, coordinating cross-functional development and stakeholder requirements definition</w:t>
       </w:r>
     </w:p>
     <w:p>
@@ -444,7 +431,7 @@
           <w:rFonts w:ascii="Calibri" w:hAnsi="Calibri"/>
           <w:sz w:val="20"/>
         </w:rPr>
-        <w:t>•  GenAI Lab program lead building LLM-powered analytics tools for enterprise research workflows, demonstrating technology implementation leadership</w:t>
+        <w:t>•  Cross-registered Nuclear Science &amp; Engineering - reactor physics, systems design</w:t>
       </w:r>
     </w:p>
     <w:p>
@@ -525,7 +512,7 @@
           <w:rFonts w:ascii="Calibri" w:hAnsi="Calibri"/>
           <w:sz w:val="20"/>
         </w:rPr>
-        <w:t>Program Management, Cross-functional Leadership, PMO Governance, Business Operations, Portfolio Management, Stakeholder Management, Enterprise Software, Change Management, Python, Defense Systems</w:t>
+        <w:t>Program Management Office (PMO), Cross-functional Leadership, Portfolio Management, Operating Model Design, Stakeholder Management, Enterprise Program Management, Governance &amp; Compliance, Python, Defense Systems, Change Management</w:t>
       </w:r>
     </w:p>
     <w:sectPr>

</xml_diff>

<commit_message>
Significantly improved formatting, ready for merge
</commit_message>
<xml_diff>
--- a/data/tailored_resumes/one-job-run/Boston_Dynamics_Head_of_Strategic_Programs__Busine_linkedin.docx
+++ b/data/tailored_resumes/one-job-run/Boston_Dynamics_Head_of_Strategic_Programs__Busine_linkedin.docx
@@ -4,520 +4,1082 @@
   <w:body>
     <w:p>
       <w:pPr>
-        <w:spacing w:before="0" w:after="0"/>
+        <w:spacing w:before="0" w:after="0" w:line="200" w:lineRule="atLeast"/>
         <w:jc w:val="center"/>
+        <w:pBdr>
+          <w:bottom w:val="single" w:sz="6" w:space="0" w:color="FFFFFF"/>
+        </w:pBdr>
       </w:pPr>
       <w:r>
         <w:rPr>
-          <w:rFonts w:ascii="Calibri" w:hAnsi="Calibri"/>
+          <w:rFonts w:ascii="Times New Roman" w:hAnsi="Times New Roman"/>
           <w:b/>
-          <w:sz w:val="28"/>
+          <w:i w:val="0"/>
+          <w:caps/>
+          <w:sz w:val="23"/>
         </w:rPr>
         <w:t>Samuel Kokomoor</w:t>
       </w:r>
     </w:p>
     <w:p>
       <w:pPr>
-        <w:spacing w:before="0" w:after="20"/>
+        <w:spacing w:before="0" w:after="0" w:line="200" w:lineRule="atLeast"/>
         <w:jc w:val="center"/>
+        <w:pBdr>
+          <w:bottom w:val="single" w:sz="6" w:space="0" w:color="FFFFFF"/>
+        </w:pBdr>
       </w:pPr>
       <w:r>
         <w:rPr>
-          <w:rFonts w:ascii="Calibri" w:hAnsi="Calibri"/>
+          <w:rFonts w:ascii="Times New Roman" w:hAnsi="Times New Roman"/>
           <w:b w:val="0"/>
-          <w:sz w:val="18"/>
+          <w:i w:val="0"/>
+          <w:sz w:val="23"/>
         </w:rPr>
-        <w:t>Boston, MA | kokomoor@mit.edu | (860) 389-5347 | linkedin.com/in/sam-kokomoor-b90629247/ | github.com/kokomoor</w:t>
+        <w:t>Boston, MA</w:t>
+      </w:r>
+      <w:r>
+        <w:rPr>
+          <w:rFonts w:ascii="Times New Roman" w:hAnsi="Times New Roman"/>
+          <w:b w:val="0"/>
+          <w:i w:val="0"/>
+          <w:sz w:val="23"/>
+          <w:color w:val="000000"/>
+        </w:rPr>
+        <w:t xml:space="preserve"> | </w:t>
+      </w:r>
+      <w:r>
+        <w:rPr>
+          <w:rFonts w:ascii="Times New Roman" w:hAnsi="Times New Roman"/>
+          <w:b w:val="0"/>
+          <w:i w:val="0"/>
+          <w:sz w:val="23"/>
+        </w:rPr>
+        <w:t>(860) 389-5347</w:t>
+      </w:r>
+      <w:r>
+        <w:rPr>
+          <w:rFonts w:ascii="Times New Roman" w:hAnsi="Times New Roman"/>
+          <w:b w:val="0"/>
+          <w:i w:val="0"/>
+          <w:sz w:val="23"/>
+          <w:color w:val="000000"/>
+        </w:rPr>
+        <w:t xml:space="preserve"> | </w:t>
+      </w:r>
+      <w:r>
+        <w:rPr>
+          <w:rFonts w:ascii="Times New Roman" w:hAnsi="Times New Roman"/>
+          <w:b w:val="0"/>
+          <w:i w:val="0"/>
+          <w:sz w:val="23"/>
+        </w:rPr>
+        <w:t>kokomoor@mit.edu</w:t>
+      </w:r>
+      <w:r>
+        <w:rPr>
+          <w:rFonts w:ascii="Times New Roman" w:hAnsi="Times New Roman"/>
+          <w:b w:val="0"/>
+          <w:i w:val="0"/>
+          <w:sz w:val="23"/>
+          <w:color w:val="000000"/>
+        </w:rPr>
+        <w:t xml:space="preserve"> | </w:t>
+      </w:r>
+      <w:r>
+        <w:rPr>
+          <w:rFonts w:ascii="Times New Roman" w:hAnsi="Times New Roman"/>
+          <w:b w:val="0"/>
+          <w:i w:val="0"/>
+          <w:sz w:val="23"/>
+          <w:color w:val="0000FF"/>
+        </w:rPr>
+        <w:t>linkedin.com/in/sam-kokomoor-b90629247/</w:t>
       </w:r>
     </w:p>
     <w:p>
       <w:pPr>
-        <w:spacing w:before="0" w:after="40"/>
-        <w:jc w:val="center"/>
+        <w:spacing w:before="0" w:after="0" w:line="200" w:lineRule="atLeast"/>
       </w:pPr>
       <w:r>
         <w:rPr>
-          <w:rFonts w:ascii="Calibri" w:hAnsi="Calibri"/>
+          <w:rFonts w:ascii="Times New Roman" w:hAnsi="Times New Roman"/>
+          <w:b w:val="0"/>
+          <w:i w:val="0"/>
+          <w:sz w:val="23"/>
+        </w:rPr>
+        <w:t xml:space="preserve"> </w:t>
+      </w:r>
+    </w:p>
+    <w:p>
+      <w:pPr>
+        <w:spacing w:before="0" w:after="0" w:line="200" w:lineRule="atLeast"/>
+        <w:pBdr>
+          <w:bottom w:val="single" w:sz="12" w:space="0" w:color="000000"/>
+        </w:pBdr>
+      </w:pPr>
+      <w:r>
+        <w:rPr>
+          <w:rFonts w:ascii="Times New Roman" w:hAnsi="Times New Roman"/>
           <w:b/>
-          <w:sz w:val="18"/>
+          <w:i w:val="0"/>
+          <w:caps/>
+          <w:sz w:val="23"/>
+        </w:rPr>
+        <w:t>education</w:t>
+      </w:r>
+    </w:p>
+    <w:p>
+      <w:pPr>
+        <w:tabs>
+          <w:tab w:pos="10354" w:val="right"/>
+        </w:tabs>
+        <w:spacing w:before="0" w:after="0" w:line="200" w:lineRule="atLeast"/>
+      </w:pPr>
+      <w:r>
+        <w:rPr>
+          <w:rFonts w:ascii="Times New Roman" w:hAnsi="Times New Roman"/>
+          <w:b/>
+          <w:i w:val="0"/>
+          <w:caps/>
+          <w:sz w:val="23"/>
+        </w:rPr>
+        <w:t>MIT Sloan School of Management</w:t>
+      </w:r>
+      <w:r>
+        <w:rPr>
+          <w:rFonts w:ascii="Times New Roman" w:hAnsi="Times New Roman"/>
+          <w:b w:val="0"/>
+          <w:i w:val="0"/>
+          <w:sz w:val="23"/>
+        </w:rPr>
+        <w:tab/>
+      </w:r>
+      <w:r>
+        <w:rPr>
+          <w:rFonts w:ascii="Times New Roman" w:hAnsi="Times New Roman"/>
+          <w:b w:val="0"/>
+          <w:i w:val="0"/>
+          <w:sz w:val="23"/>
+        </w:rPr>
+        <w:t>Cambridge, MA</w:t>
+      </w:r>
+    </w:p>
+    <w:p>
+      <w:pPr>
+        <w:tabs>
+          <w:tab w:pos="10354" w:val="right"/>
+        </w:tabs>
+        <w:spacing w:before="0" w:after="0" w:line="200" w:lineRule="atLeast"/>
+      </w:pPr>
+      <w:r>
+        <w:rPr>
+          <w:rFonts w:ascii="Times New Roman" w:hAnsi="Times New Roman"/>
+          <w:b w:val="0"/>
+          <w:i/>
+          <w:sz w:val="23"/>
+        </w:rPr>
+        <w:t>Candidate for MBA, May 2026</w:t>
+      </w:r>
+      <w:r>
+        <w:rPr>
+          <w:rFonts w:ascii="Times New Roman" w:hAnsi="Times New Roman"/>
+          <w:b w:val="0"/>
+          <w:i w:val="0"/>
+          <w:sz w:val="23"/>
+        </w:rPr>
+        <w:tab/>
+      </w:r>
+      <w:r>
+        <w:rPr>
+          <w:rFonts w:ascii="Times New Roman" w:hAnsi="Times New Roman"/>
+          <w:b w:val="0"/>
+          <w:i w:val="0"/>
+          <w:sz w:val="23"/>
+        </w:rPr>
+        <w:t>2024 - Present</w:t>
+      </w:r>
+    </w:p>
+    <w:p>
+      <w:pPr>
+        <w:spacing w:before="0" w:after="0" w:line="200" w:lineRule="atLeast"/>
+        <w:ind w:left="270" w:hanging="280"/>
+        <w:numPr>
+          <w:ilvl w:val="0"/>
+          <w:numId w:val="1"/>
+        </w:numPr>
+      </w:pPr>
+      <w:r>
+        <w:rPr>
+          <w:rFonts w:ascii="Times New Roman" w:hAnsi="Times New Roman"/>
+          <w:b w:val="0"/>
+          <w:i w:val="0"/>
+          <w:sz w:val="23"/>
+        </w:rPr>
+        <w:t>GenAI Lab project lead; built LLM-powered analytics tools for enterprise research workflows, managing cross-functional stakeholder requirements and technical delivery</w:t>
+      </w:r>
+    </w:p>
+    <w:p>
+      <w:pPr>
+        <w:spacing w:before="0" w:after="0" w:line="200" w:lineRule="atLeast"/>
+        <w:ind w:left="270" w:hanging="280"/>
+        <w:numPr>
+          <w:ilvl w:val="0"/>
+          <w:numId w:val="1"/>
+        </w:numPr>
+      </w:pPr>
+      <w:r>
+        <w:rPr>
+          <w:rFonts w:ascii="Times New Roman" w:hAnsi="Times New Roman"/>
+          <w:b w:val="0"/>
+          <w:i w:val="0"/>
+          <w:sz w:val="23"/>
+        </w:rPr>
+        <w:t>Built Grid Stress Tracker project using a hybrid GRU plus MLP architecture to predict high-demand grid stress events from sequential demand and weather/tabular inputs; achieved 0.961 precision, 0.929 recall, and 0.945 F1 on held-out test data (github.com/kokomoor/Grid_Stress_Tracker)</w:t>
+      </w:r>
+    </w:p>
+    <w:p>
+      <w:pPr>
+        <w:tabs>
+          <w:tab w:pos="10354" w:val="right"/>
+        </w:tabs>
+        <w:spacing w:before="0" w:after="0" w:line="200" w:lineRule="atLeast"/>
+      </w:pPr>
+      <w:r>
+        <w:rPr>
+          <w:rFonts w:ascii="Times New Roman" w:hAnsi="Times New Roman"/>
+          <w:b/>
+          <w:i w:val="0"/>
+          <w:caps/>
+          <w:sz w:val="23"/>
+        </w:rPr>
+        <w:t>University of Connecticut</w:t>
+      </w:r>
+      <w:r>
+        <w:rPr>
+          <w:rFonts w:ascii="Times New Roman" w:hAnsi="Times New Roman"/>
+          <w:b w:val="0"/>
+          <w:i w:val="0"/>
+          <w:sz w:val="23"/>
+        </w:rPr>
+        <w:tab/>
+      </w:r>
+      <w:r>
+        <w:rPr>
+          <w:rFonts w:ascii="Times New Roman" w:hAnsi="Times New Roman"/>
+          <w:b w:val="0"/>
+          <w:i w:val="0"/>
+          <w:sz w:val="23"/>
+        </w:rPr>
+        <w:t>Storrs, CT</w:t>
+      </w:r>
+    </w:p>
+    <w:p>
+      <w:pPr>
+        <w:tabs>
+          <w:tab w:pos="10354" w:val="right"/>
+        </w:tabs>
+        <w:spacing w:before="0" w:after="0" w:line="200" w:lineRule="atLeast"/>
+      </w:pPr>
+      <w:r>
+        <w:rPr>
+          <w:rFonts w:ascii="Times New Roman" w:hAnsi="Times New Roman"/>
+          <w:b w:val="0"/>
+          <w:i/>
+          <w:sz w:val="23"/>
+        </w:rPr>
+        <w:t>BS Computer Engineering, BS Electrical Engineering, BA Computer Science, Math Minor</w:t>
+      </w:r>
+      <w:r>
+        <w:rPr>
+          <w:rFonts w:ascii="Times New Roman" w:hAnsi="Times New Roman"/>
+          <w:b w:val="0"/>
+          <w:i w:val="0"/>
+          <w:sz w:val="23"/>
+        </w:rPr>
+        <w:tab/>
+      </w:r>
+      <w:r>
+        <w:rPr>
+          <w:rFonts w:ascii="Times New Roman" w:hAnsi="Times New Roman"/>
+          <w:b w:val="0"/>
+          <w:i w:val="0"/>
+          <w:sz w:val="23"/>
+        </w:rPr>
+        <w:t>2021</w:t>
+      </w:r>
+    </w:p>
+    <w:p>
+      <w:pPr>
+        <w:spacing w:before="0" w:after="0" w:line="200" w:lineRule="atLeast"/>
+        <w:ind w:left="270" w:hanging="280"/>
+        <w:numPr>
+          <w:ilvl w:val="0"/>
+          <w:numId w:val="1"/>
+        </w:numPr>
+      </w:pPr>
+      <w:r>
+        <w:rPr>
+          <w:rFonts w:ascii="Times New Roman" w:hAnsi="Times New Roman"/>
+          <w:b w:val="0"/>
+          <w:i w:val="0"/>
+          <w:sz w:val="23"/>
+        </w:rPr>
+        <w:t>LSTM time-series prediction research on near-surface wave and wake forces for simulated hydrofoils, modeling how submarine wake signatures become more detectable near the surface</w:t>
+      </w:r>
+    </w:p>
+    <w:p>
+      <w:pPr>
+        <w:spacing w:before="0" w:after="0" w:line="200" w:lineRule="atLeast"/>
+      </w:pPr>
+      <w:r>
+        <w:rPr>
+          <w:rFonts w:ascii="Times New Roman" w:hAnsi="Times New Roman"/>
+          <w:b w:val="0"/>
+          <w:i w:val="0"/>
+          <w:sz w:val="23"/>
+        </w:rPr>
+        <w:t xml:space="preserve"> </w:t>
+      </w:r>
+    </w:p>
+    <w:p>
+      <w:pPr>
+        <w:spacing w:before="0" w:after="0" w:line="200" w:lineRule="atLeast"/>
+        <w:pBdr>
+          <w:bottom w:val="single" w:sz="12" w:space="0" w:color="000000"/>
+        </w:pBdr>
+      </w:pPr>
+      <w:r>
+        <w:rPr>
+          <w:rFonts w:ascii="Times New Roman" w:hAnsi="Times New Roman"/>
+          <w:b/>
+          <w:i w:val="0"/>
+          <w:caps/>
+          <w:sz w:val="23"/>
+        </w:rPr>
+        <w:t>experience</w:t>
+      </w:r>
+    </w:p>
+    <w:p>
+      <w:pPr>
+        <w:tabs>
+          <w:tab w:pos="10354" w:val="right"/>
+        </w:tabs>
+        <w:spacing w:before="0" w:after="0" w:line="200" w:lineRule="atLeast"/>
+      </w:pPr>
+      <w:r>
+        <w:rPr>
+          <w:rFonts w:ascii="Times New Roman" w:hAnsi="Times New Roman"/>
+          <w:b/>
+          <w:i w:val="0"/>
+          <w:caps/>
+          <w:sz w:val="23"/>
+        </w:rPr>
+        <w:t>MIT Co-ops</w:t>
+      </w:r>
+      <w:r>
+        <w:rPr>
+          <w:rFonts w:ascii="Times New Roman" w:hAnsi="Times New Roman"/>
+          <w:b w:val="0"/>
+          <w:i w:val="0"/>
+          <w:sz w:val="23"/>
+        </w:rPr>
+        <w:tab/>
+      </w:r>
+      <w:r>
+        <w:rPr>
+          <w:rFonts w:ascii="Times New Roman" w:hAnsi="Times New Roman"/>
+          <w:b w:val="0"/>
+          <w:i w:val="0"/>
+          <w:sz w:val="23"/>
+        </w:rPr>
+        <w:t>Cambridge, MA</w:t>
+      </w:r>
+    </w:p>
+    <w:p>
+      <w:pPr>
+        <w:tabs>
+          <w:tab w:pos="10354" w:val="right"/>
+        </w:tabs>
+        <w:spacing w:before="0" w:after="0" w:line="200" w:lineRule="atLeast"/>
+      </w:pPr>
+      <w:r>
+        <w:rPr>
+          <w:rFonts w:ascii="Times New Roman" w:hAnsi="Times New Roman"/>
+          <w:b/>
+          <w:i/>
+          <w:sz w:val="23"/>
+        </w:rPr>
+        <w:t>Operational and Technical MIT-Industry Co-op Programs</w:t>
+      </w:r>
+      <w:r>
+        <w:rPr>
+          <w:rFonts w:ascii="Times New Roman" w:hAnsi="Times New Roman"/>
+          <w:b w:val="0"/>
+          <w:i w:val="0"/>
+          <w:sz w:val="23"/>
+        </w:rPr>
+        <w:tab/>
+      </w:r>
+      <w:r>
+        <w:rPr>
+          <w:rFonts w:ascii="Times New Roman" w:hAnsi="Times New Roman"/>
+          <w:b w:val="0"/>
+          <w:i w:val="0"/>
+          <w:sz w:val="23"/>
+        </w:rPr>
+        <w:t>2025 - Present</w:t>
+      </w:r>
+    </w:p>
+    <w:p>
+      <w:pPr>
+        <w:spacing w:before="0" w:after="0" w:line="200" w:lineRule="atLeast"/>
+        <w:ind w:left="270" w:hanging="280"/>
+        <w:numPr>
+          <w:ilvl w:val="0"/>
+          <w:numId w:val="1"/>
+        </w:numPr>
+      </w:pPr>
+      <w:r>
+        <w:rPr>
+          <w:rFonts w:ascii="Times New Roman" w:hAnsi="Times New Roman"/>
+          <w:b w:val="0"/>
+          <w:i w:val="0"/>
+          <w:sz w:val="23"/>
+        </w:rPr>
+        <w:t>Led cross-functional GTM strategy and technical requirements definition for EMR data product at Helium Health; managed stakeholder alignment across international teams with on-site integration in Nairobi</w:t>
+      </w:r>
+    </w:p>
+    <w:p>
+      <w:pPr>
+        <w:spacing w:before="0" w:after="0" w:line="200" w:lineRule="atLeast"/>
+        <w:ind w:left="270" w:hanging="280"/>
+        <w:numPr>
+          <w:ilvl w:val="0"/>
+          <w:numId w:val="1"/>
+        </w:numPr>
+      </w:pPr>
+      <w:r>
+        <w:rPr>
+          <w:rFonts w:ascii="Times New Roman" w:hAnsi="Times New Roman"/>
+          <w:b w:val="0"/>
+          <w:i w:val="0"/>
+          <w:sz w:val="23"/>
+        </w:rPr>
+        <w:t>Built genAI analytics MVP detecting discrimination patterns across 10K+ court documents for ICAAD; managed end-to-end program delivery for international human rights NGO</w:t>
+      </w:r>
+    </w:p>
+    <w:p>
+      <w:pPr>
+        <w:spacing w:before="0" w:after="0" w:line="200" w:lineRule="atLeast"/>
+      </w:pPr>
+      <w:r>
+        <w:rPr>
+          <w:rFonts w:ascii="Times New Roman" w:hAnsi="Times New Roman"/>
+          <w:b w:val="0"/>
+          <w:i w:val="0"/>
+          <w:sz w:val="23"/>
+        </w:rPr>
+        <w:t xml:space="preserve"> </w:t>
+      </w:r>
+    </w:p>
+    <w:p>
+      <w:pPr>
+        <w:tabs>
+          <w:tab w:pos="10354" w:val="right"/>
+        </w:tabs>
+        <w:spacing w:before="0" w:after="0" w:line="200" w:lineRule="atLeast"/>
+      </w:pPr>
+      <w:r>
+        <w:rPr>
+          <w:rFonts w:ascii="Times New Roman" w:hAnsi="Times New Roman"/>
+          <w:b/>
+          <w:i w:val="0"/>
+          <w:caps/>
+          <w:sz w:val="23"/>
+        </w:rPr>
+        <w:t>Gauntlet-42 LLC</w:t>
+      </w:r>
+      <w:r>
+        <w:rPr>
+          <w:rFonts w:ascii="Times New Roman" w:hAnsi="Times New Roman"/>
+          <w:b w:val="0"/>
+          <w:i w:val="0"/>
+          <w:sz w:val="23"/>
+        </w:rPr>
+        <w:tab/>
+      </w:r>
+      <w:r>
+        <w:rPr>
+          <w:rFonts w:ascii="Times New Roman" w:hAnsi="Times New Roman"/>
+          <w:b w:val="0"/>
+          <w:i w:val="0"/>
+          <w:sz w:val="23"/>
+        </w:rPr>
+        <w:t>Boston, MA</w:t>
+      </w:r>
+    </w:p>
+    <w:p>
+      <w:pPr>
+        <w:spacing w:before="0" w:after="0" w:line="200" w:lineRule="atLeast"/>
+      </w:pPr>
+      <w:r>
+        <w:rPr>
+          <w:rFonts w:ascii="Times New Roman" w:hAnsi="Times New Roman"/>
+          <w:b w:val="0"/>
+          <w:i/>
+          <w:sz w:val="23"/>
+        </w:rPr>
+        <w:t>PropTech B2B SaaS Startup</w:t>
+      </w:r>
+    </w:p>
+    <w:p>
+      <w:pPr>
+        <w:tabs>
+          <w:tab w:pos="10354" w:val="right"/>
+        </w:tabs>
+        <w:spacing w:before="0" w:after="0" w:line="200" w:lineRule="atLeast"/>
+      </w:pPr>
+      <w:r>
+        <w:rPr>
+          <w:rFonts w:ascii="Times New Roman" w:hAnsi="Times New Roman"/>
+          <w:b/>
+          <w:i/>
+          <w:sz w:val="23"/>
+        </w:rPr>
+        <w:t>Cofounder</w:t>
+      </w:r>
+      <w:r>
+        <w:rPr>
+          <w:rFonts w:ascii="Times New Roman" w:hAnsi="Times New Roman"/>
+          <w:b w:val="0"/>
+          <w:i w:val="0"/>
+          <w:sz w:val="23"/>
+        </w:rPr>
+        <w:tab/>
+      </w:r>
+      <w:r>
+        <w:rPr>
+          <w:rFonts w:ascii="Times New Roman" w:hAnsi="Times New Roman"/>
+          <w:b w:val="0"/>
+          <w:i w:val="0"/>
+          <w:sz w:val="23"/>
+        </w:rPr>
+        <w:t>2022 - Present</w:t>
+      </w:r>
+    </w:p>
+    <w:p>
+      <w:pPr>
+        <w:spacing w:before="0" w:after="0" w:line="200" w:lineRule="atLeast"/>
+        <w:ind w:left="270" w:hanging="280"/>
+        <w:numPr>
+          <w:ilvl w:val="0"/>
+          <w:numId w:val="1"/>
+        </w:numPr>
+      </w:pPr>
+      <w:r>
+        <w:rPr>
+          <w:rFonts w:ascii="Times New Roman" w:hAnsi="Times New Roman"/>
+          <w:b w:val="0"/>
+          <w:i w:val="0"/>
+          <w:sz w:val="23"/>
+        </w:rPr>
+        <w:t>Architected Spyglass enterprise initiative, an AI-native automated public-records platform with OCR, NLP/LLM extraction, and orchestration pipeline; led cross-functional program management across technical and business operations</w:t>
+      </w:r>
+    </w:p>
+    <w:p>
+      <w:pPr>
+        <w:spacing w:before="0" w:after="0" w:line="200" w:lineRule="atLeast"/>
+        <w:ind w:left="270" w:hanging="280"/>
+        <w:numPr>
+          <w:ilvl w:val="0"/>
+          <w:numId w:val="1"/>
+        </w:numPr>
+      </w:pPr>
+      <w:r>
+        <w:rPr>
+          <w:rFonts w:ascii="Times New Roman" w:hAnsi="Times New Roman"/>
+          <w:b w:val="0"/>
+          <w:i w:val="0"/>
+          <w:sz w:val="23"/>
+        </w:rPr>
+        <w:t>Built and managed 3-person engineering team with zero turnover across 3+ years; established PMO capabilities and governance frameworks for startup scaling</w:t>
+      </w:r>
+    </w:p>
+    <w:p>
+      <w:pPr>
+        <w:spacing w:before="0" w:after="0" w:line="200" w:lineRule="atLeast"/>
+        <w:ind w:left="270" w:hanging="280"/>
+        <w:numPr>
+          <w:ilvl w:val="0"/>
+          <w:numId w:val="1"/>
+        </w:numPr>
+      </w:pPr>
+      <w:r>
+        <w:rPr>
+          <w:rFonts w:ascii="Times New Roman" w:hAnsi="Times New Roman"/>
+          <w:b w:val="0"/>
+          <w:i w:val="0"/>
+          <w:sz w:val="23"/>
+        </w:rPr>
+        <w:t>Designed end-to-end operating model for OCR to NLP/LLM extraction pipeline processing thousands of records with &lt;2% error rate; implemented governance and quality controls</w:t>
+      </w:r>
+    </w:p>
+    <w:p>
+      <w:pPr>
+        <w:spacing w:before="0" w:after="0" w:line="200" w:lineRule="atLeast"/>
+      </w:pPr>
+      <w:r>
+        <w:rPr>
+          <w:rFonts w:ascii="Times New Roman" w:hAnsi="Times New Roman"/>
+          <w:b w:val="0"/>
+          <w:i w:val="0"/>
+          <w:sz w:val="23"/>
+        </w:rPr>
+        <w:t xml:space="preserve"> </w:t>
+      </w:r>
+    </w:p>
+    <w:p>
+      <w:pPr>
+        <w:tabs>
+          <w:tab w:pos="10354" w:val="right"/>
+        </w:tabs>
+        <w:spacing w:before="0" w:after="0" w:line="200" w:lineRule="atLeast"/>
+      </w:pPr>
+      <w:r>
+        <w:rPr>
+          <w:rFonts w:ascii="Times New Roman" w:hAnsi="Times New Roman"/>
+          <w:b/>
+          <w:i w:val="0"/>
+          <w:caps/>
+          <w:sz w:val="23"/>
+        </w:rPr>
+        <w:t>MIT Lincoln Laboratory</w:t>
+      </w:r>
+      <w:r>
+        <w:rPr>
+          <w:rFonts w:ascii="Times New Roman" w:hAnsi="Times New Roman"/>
+          <w:b w:val="0"/>
+          <w:i w:val="0"/>
+          <w:sz w:val="23"/>
+        </w:rPr>
+        <w:tab/>
+      </w:r>
+      <w:r>
+        <w:rPr>
+          <w:rFonts w:ascii="Times New Roman" w:hAnsi="Times New Roman"/>
+          <w:b w:val="0"/>
+          <w:i w:val="0"/>
+          <w:sz w:val="23"/>
+        </w:rPr>
+        <w:t>Lexington, MA</w:t>
+      </w:r>
+    </w:p>
+    <w:p>
+      <w:pPr>
+        <w:spacing w:before="0" w:after="0" w:line="200" w:lineRule="atLeast"/>
+      </w:pPr>
+      <w:r>
+        <w:rPr>
+          <w:rFonts w:ascii="Times New Roman" w:hAnsi="Times New Roman"/>
+          <w:b w:val="0"/>
+          <w:i/>
+          <w:sz w:val="23"/>
+        </w:rPr>
+        <w:t>Federally Funded Research and Development Center</w:t>
+      </w:r>
+    </w:p>
+    <w:p>
+      <w:pPr>
+        <w:tabs>
+          <w:tab w:pos="10354" w:val="right"/>
+        </w:tabs>
+        <w:spacing w:before="0" w:after="0" w:line="200" w:lineRule="atLeast"/>
+      </w:pPr>
+      <w:r>
+        <w:rPr>
+          <w:rFonts w:ascii="Times New Roman" w:hAnsi="Times New Roman"/>
+          <w:b/>
+          <w:i/>
+          <w:sz w:val="23"/>
+        </w:rPr>
+        <w:t>Embedded Software Engineer</w:t>
+      </w:r>
+      <w:r>
+        <w:rPr>
+          <w:rFonts w:ascii="Times New Roman" w:hAnsi="Times New Roman"/>
+          <w:b w:val="0"/>
+          <w:i w:val="0"/>
+          <w:sz w:val="23"/>
+        </w:rPr>
+        <w:tab/>
+      </w:r>
+      <w:r>
+        <w:rPr>
+          <w:rFonts w:ascii="Times New Roman" w:hAnsi="Times New Roman"/>
+          <w:b w:val="0"/>
+          <w:i w:val="0"/>
+          <w:sz w:val="23"/>
+        </w:rPr>
+        <w:t>2023 - 2025</w:t>
+      </w:r>
+    </w:p>
+    <w:p>
+      <w:pPr>
+        <w:spacing w:before="0" w:after="0" w:line="200" w:lineRule="atLeast"/>
+        <w:ind w:left="270" w:hanging="280"/>
+        <w:numPr>
+          <w:ilvl w:val="0"/>
+          <w:numId w:val="1"/>
+        </w:numPr>
+      </w:pPr>
+      <w:r>
+        <w:rPr>
+          <w:rFonts w:ascii="Times New Roman" w:hAnsi="Times New Roman"/>
+          <w:b w:val="0"/>
+          <w:i w:val="0"/>
+          <w:sz w:val="23"/>
+        </w:rPr>
+        <w:t>Led program management for $100M Army RADAR modernization initiative across next-generation phased array systems; coordinated cross-functional teams and stakeholder alignment</w:t>
+      </w:r>
+    </w:p>
+    <w:p>
+      <w:pPr>
+        <w:spacing w:before="0" w:after="0" w:line="200" w:lineRule="atLeast"/>
+        <w:ind w:left="270" w:hanging="280"/>
+        <w:numPr>
+          <w:ilvl w:val="0"/>
+          <w:numId w:val="1"/>
+        </w:numPr>
+      </w:pPr>
+      <w:r>
+        <w:rPr>
+          <w:rFonts w:ascii="Times New Roman" w:hAnsi="Times New Roman"/>
+          <w:b w:val="0"/>
+          <w:i w:val="0"/>
+          <w:sz w:val="23"/>
+        </w:rPr>
+        <w:t>Designed enterprise test platform bridging C++ firmware to Python data pipeline; established governance framework enabling automated regression testing across 200+ test cases</w:t>
+      </w:r>
+    </w:p>
+    <w:p>
+      <w:pPr>
+        <w:spacing w:before="0" w:after="0" w:line="200" w:lineRule="atLeast"/>
+        <w:ind w:left="270" w:hanging="280"/>
+        <w:numPr>
+          <w:ilvl w:val="0"/>
+          <w:numId w:val="1"/>
+        </w:numPr>
+      </w:pPr>
+      <w:r>
+        <w:rPr>
+          <w:rFonts w:ascii="Times New Roman" w:hAnsi="Times New Roman"/>
+          <w:b w:val="0"/>
+          <w:i w:val="0"/>
+          <w:sz w:val="23"/>
+        </w:rPr>
+        <w:t>Managed software deployment to Reagan Test Site, Kwajalein Atoll; ensured compliance and governance standards for mission-critical RADAR systems in operational DoD environment</w:t>
+      </w:r>
+    </w:p>
+    <w:p>
+      <w:pPr>
+        <w:spacing w:before="0" w:after="0" w:line="200" w:lineRule="atLeast"/>
+        <w:ind w:left="270" w:hanging="280"/>
+        <w:numPr>
+          <w:ilvl w:val="0"/>
+          <w:numId w:val="1"/>
+        </w:numPr>
+      </w:pPr>
+      <w:r>
+        <w:rPr>
+          <w:rFonts w:ascii="Times New Roman" w:hAnsi="Times New Roman"/>
+          <w:b w:val="0"/>
+          <w:i w:val="0"/>
+          <w:sz w:val="23"/>
+        </w:rPr>
+        <w:t>Implemented arbitrary waveform generation algorithms for RADAR phased array beam steering, optimizing signal fidelity for multi-target tracking</w:t>
+      </w:r>
+    </w:p>
+    <w:p>
+      <w:pPr>
+        <w:spacing w:before="0" w:after="0" w:line="200" w:lineRule="atLeast"/>
+      </w:pPr>
+      <w:r>
+        <w:rPr>
+          <w:rFonts w:ascii="Times New Roman" w:hAnsi="Times New Roman"/>
+          <w:b w:val="0"/>
+          <w:i w:val="0"/>
+          <w:sz w:val="23"/>
+        </w:rPr>
+        <w:t xml:space="preserve"> </w:t>
+      </w:r>
+    </w:p>
+    <w:p>
+      <w:pPr>
+        <w:tabs>
+          <w:tab w:pos="10354" w:val="right"/>
+        </w:tabs>
+        <w:spacing w:before="0" w:after="0" w:line="200" w:lineRule="atLeast"/>
+      </w:pPr>
+      <w:r>
+        <w:rPr>
+          <w:rFonts w:ascii="Times New Roman" w:hAnsi="Times New Roman"/>
+          <w:b/>
+          <w:i w:val="0"/>
+          <w:caps/>
+          <w:sz w:val="23"/>
+        </w:rPr>
+        <w:t>General Dynamics, Electric Boat</w:t>
+      </w:r>
+      <w:r>
+        <w:rPr>
+          <w:rFonts w:ascii="Times New Roman" w:hAnsi="Times New Roman"/>
+          <w:b w:val="0"/>
+          <w:i w:val="0"/>
+          <w:sz w:val="23"/>
+        </w:rPr>
+        <w:tab/>
+      </w:r>
+      <w:r>
+        <w:rPr>
+          <w:rFonts w:ascii="Times New Roman" w:hAnsi="Times New Roman"/>
+          <w:b w:val="0"/>
+          <w:i w:val="0"/>
+          <w:sz w:val="23"/>
+        </w:rPr>
+        <w:t>Groton, CT</w:t>
+      </w:r>
+    </w:p>
+    <w:p>
+      <w:pPr>
+        <w:spacing w:before="0" w:after="0" w:line="200" w:lineRule="atLeast"/>
+      </w:pPr>
+      <w:r>
+        <w:rPr>
+          <w:rFonts w:ascii="Times New Roman" w:hAnsi="Times New Roman"/>
+          <w:b w:val="0"/>
+          <w:i/>
+          <w:sz w:val="23"/>
+        </w:rPr>
+        <w:t>Defense Contractor</w:t>
+      </w:r>
+    </w:p>
+    <w:p>
+      <w:pPr>
+        <w:tabs>
+          <w:tab w:pos="10354" w:val="right"/>
+        </w:tabs>
+        <w:spacing w:before="0" w:after="0" w:line="200" w:lineRule="atLeast"/>
+      </w:pPr>
+      <w:r>
+        <w:rPr>
+          <w:rFonts w:ascii="Times New Roman" w:hAnsi="Times New Roman"/>
+          <w:b/>
+          <w:i/>
+          <w:sz w:val="23"/>
+        </w:rPr>
+        <w:t>Engineer I, Engineer II</w:t>
+      </w:r>
+      <w:r>
+        <w:rPr>
+          <w:rFonts w:ascii="Times New Roman" w:hAnsi="Times New Roman"/>
+          <w:b w:val="0"/>
+          <w:i w:val="0"/>
+          <w:sz w:val="23"/>
+        </w:rPr>
+        <w:tab/>
+      </w:r>
+      <w:r>
+        <w:rPr>
+          <w:rFonts w:ascii="Times New Roman" w:hAnsi="Times New Roman"/>
+          <w:b w:val="0"/>
+          <w:i w:val="0"/>
+          <w:sz w:val="23"/>
+        </w:rPr>
+        <w:t>2021 - 2023</w:t>
+      </w:r>
+    </w:p>
+    <w:p>
+      <w:pPr>
+        <w:spacing w:before="0" w:after="0" w:line="200" w:lineRule="atLeast"/>
+        <w:ind w:left="270" w:hanging="280"/>
+        <w:numPr>
+          <w:ilvl w:val="0"/>
+          <w:numId w:val="1"/>
+        </w:numPr>
+      </w:pPr>
+      <w:r>
+        <w:rPr>
+          <w:rFonts w:ascii="Times New Roman" w:hAnsi="Times New Roman"/>
+          <w:b w:val="0"/>
+          <w:i w:val="0"/>
+          <w:sz w:val="23"/>
+        </w:rPr>
+        <w:t>Managed cross-functional team of 5 technicians and 3 junior engineers on submarine flight-critical hardware testing programs; established PMO processes and governance frameworks</w:t>
+      </w:r>
+    </w:p>
+    <w:p>
+      <w:pPr>
+        <w:spacing w:before="0" w:after="0" w:line="200" w:lineRule="atLeast"/>
+        <w:ind w:left="270" w:hanging="280"/>
+        <w:numPr>
+          <w:ilvl w:val="0"/>
+          <w:numId w:val="1"/>
+        </w:numPr>
+      </w:pPr>
+      <w:r>
+        <w:rPr>
+          <w:rFonts w:ascii="Times New Roman" w:hAnsi="Times New Roman"/>
+          <w:b w:val="0"/>
+          <w:i w:val="0"/>
+          <w:sz w:val="23"/>
+        </w:rPr>
+        <w:t>Led portfolio management for Columbia-class submarine flight-critical hardware qualification; ensured enterprise compliance with MIL-STD requirements and audit readiness</w:t>
+      </w:r>
+    </w:p>
+    <w:p>
+      <w:pPr>
+        <w:spacing w:before="0" w:after="0" w:line="200" w:lineRule="atLeast"/>
+        <w:ind w:left="270" w:hanging="280"/>
+        <w:numPr>
+          <w:ilvl w:val="0"/>
+          <w:numId w:val="1"/>
+        </w:numPr>
+      </w:pPr>
+      <w:r>
+        <w:rPr>
+          <w:rFonts w:ascii="Times New Roman" w:hAnsi="Times New Roman"/>
+          <w:b w:val="0"/>
+          <w:i w:val="0"/>
+          <w:sz w:val="23"/>
+        </w:rPr>
+        <w:t>Identified and implemented process improvements through operating model redesign, saving the US Navy $2M in testing and qualification costs; demonstrated ROI through governance metrics</w:t>
+      </w:r>
+    </w:p>
+    <w:p>
+      <w:pPr>
+        <w:spacing w:before="0" w:after="0" w:line="200" w:lineRule="atLeast"/>
+        <w:ind w:left="270" w:hanging="280"/>
+        <w:numPr>
+          <w:ilvl w:val="0"/>
+          <w:numId w:val="1"/>
+        </w:numPr>
+      </w:pPr>
+      <w:r>
+        <w:rPr>
+          <w:rFonts w:ascii="Times New Roman" w:hAnsi="Times New Roman"/>
+          <w:b w:val="0"/>
+          <w:i w:val="0"/>
+          <w:sz w:val="23"/>
+        </w:rPr>
+        <w:t>Received leadership commendation for program management of hardware testbed Mk. IV delivery ahead of schedule and under budget; established portfolio prioritization framework</w:t>
+      </w:r>
+    </w:p>
+    <w:p>
+      <w:pPr>
+        <w:spacing w:before="0" w:after="0" w:line="200" w:lineRule="atLeast"/>
+      </w:pPr>
+      <w:r>
+        <w:rPr>
+          <w:rFonts w:ascii="Times New Roman" w:hAnsi="Times New Roman"/>
+          <w:b w:val="0"/>
+          <w:i w:val="0"/>
+          <w:sz w:val="23"/>
+        </w:rPr>
+        <w:t xml:space="preserve"> </w:t>
+      </w:r>
+    </w:p>
+    <w:p>
+      <w:pPr>
+        <w:spacing w:before="0" w:after="0" w:line="200" w:lineRule="atLeast"/>
+        <w:pBdr>
+          <w:bottom w:val="single" w:sz="12" w:space="0" w:color="000000"/>
+        </w:pBdr>
+      </w:pPr>
+      <w:r>
+        <w:rPr>
+          <w:rFonts w:ascii="Times New Roman" w:hAnsi="Times New Roman"/>
+          <w:b/>
+          <w:i w:val="0"/>
+          <w:caps/>
+          <w:sz w:val="23"/>
+        </w:rPr>
+        <w:t>technical skills</w:t>
+      </w:r>
+    </w:p>
+    <w:p>
+      <w:pPr>
+        <w:spacing w:before="0" w:after="0" w:line="200" w:lineRule="atLeast"/>
+        <w:ind w:left="270" w:hanging="280"/>
+        <w:numPr>
+          <w:ilvl w:val="0"/>
+          <w:numId w:val="1"/>
+        </w:numPr>
+      </w:pPr>
+      <w:r>
+        <w:rPr>
+          <w:rFonts w:ascii="Times New Roman" w:hAnsi="Times New Roman"/>
+          <w:b w:val="0"/>
+          <w:i w:val="0"/>
+          <w:sz w:val="23"/>
+        </w:rPr>
+        <w:t>Program Management, PMO Leadership, Cross-functional Leadership, Portfolio Management, Business Operations, Stakeholder Management, Governance, Enterprise Initiatives, Change Management, Python</w:t>
+      </w:r>
+    </w:p>
+    <w:p>
+      <w:pPr>
+        <w:spacing w:before="0" w:after="0" w:line="200" w:lineRule="atLeast"/>
+      </w:pPr>
+      <w:r>
+        <w:rPr>
+          <w:rFonts w:ascii="Times New Roman" w:hAnsi="Times New Roman"/>
+          <w:b w:val="0"/>
+          <w:i w:val="0"/>
+          <w:sz w:val="23"/>
+        </w:rPr>
+        <w:t xml:space="preserve"> </w:t>
+      </w:r>
+    </w:p>
+    <w:p>
+      <w:pPr>
+        <w:spacing w:before="0" w:after="0" w:line="200" w:lineRule="atLeast"/>
+        <w:pBdr>
+          <w:bottom w:val="single" w:sz="12" w:space="0" w:color="000000"/>
+        </w:pBdr>
+      </w:pPr>
+      <w:r>
+        <w:rPr>
+          <w:rFonts w:ascii="Times New Roman" w:hAnsi="Times New Roman"/>
+          <w:b/>
+          <w:i w:val="0"/>
+          <w:caps/>
+          <w:sz w:val="23"/>
+        </w:rPr>
+        <w:t>additional information</w:t>
+      </w:r>
+    </w:p>
+    <w:p>
+      <w:pPr>
+        <w:spacing w:before="0" w:after="0" w:line="200" w:lineRule="atLeast"/>
+        <w:ind w:left="270" w:hanging="280"/>
+        <w:numPr>
+          <w:ilvl w:val="0"/>
+          <w:numId w:val="1"/>
+        </w:numPr>
+      </w:pPr>
+      <w:r>
+        <w:rPr>
+          <w:rFonts w:ascii="Times New Roman" w:hAnsi="Times New Roman"/>
+          <w:b w:val="0"/>
+          <w:i w:val="0"/>
+          <w:sz w:val="23"/>
         </w:rPr>
         <w:t>DoD Final Secret (active)</w:t>
       </w:r>
     </w:p>
-    <w:p>
-      <w:pPr>
-        <w:spacing w:before="160" w:after="40"/>
-        <w:pBdr>
-          <w:bottom w:val="single" w:sz="4" w:space="1" w:color="333333"/>
-        </w:pBdr>
-      </w:pPr>
-      <w:r>
-        <w:rPr>
-          <w:rFonts w:ascii="Calibri" w:hAnsi="Calibri"/>
-          <w:b/>
-          <w:sz w:val="22"/>
-        </w:rPr>
-        <w:t>PROFESSIONAL SUMMARY</w:t>
-      </w:r>
-    </w:p>
-    <w:p>
-      <w:pPr>
-        <w:spacing w:before="20" w:after="20"/>
-      </w:pPr>
-      <w:r>
-        <w:rPr>
-          <w:rFonts w:ascii="Calibri" w:hAnsi="Calibri"/>
-          <w:sz w:val="20"/>
-        </w:rPr>
-        <w:t>Director-level program management leader with 8+ years scaling PMO operations, leading cross-functional enterprise programs, and building governance frameworks across defense, technology, and manufacturing environments.</w:t>
-      </w:r>
-    </w:p>
-    <w:p>
-      <w:pPr>
-        <w:spacing w:before="160" w:after="40"/>
-        <w:pBdr>
-          <w:bottom w:val="single" w:sz="4" w:space="1" w:color="333333"/>
-        </w:pBdr>
-      </w:pPr>
-      <w:r>
-        <w:rPr>
-          <w:rFonts w:ascii="Calibri" w:hAnsi="Calibri"/>
-          <w:b/>
-          <w:sz w:val="22"/>
-        </w:rPr>
-        <w:t>EXPERIENCE</w:t>
-      </w:r>
-    </w:p>
-    <w:p>
-      <w:pPr>
-        <w:spacing w:before="80" w:after="0"/>
-      </w:pPr>
-      <w:r>
-        <w:rPr>
-          <w:rFonts w:ascii="Calibri" w:hAnsi="Calibri"/>
-          <w:b/>
-          <w:sz w:val="20"/>
-        </w:rPr>
-        <w:t>General Dynamics Electric Boat - Engineer I -&gt; Engineer II</w:t>
-      </w:r>
-      <w:r>
-        <w:rPr>
-          <w:rFonts w:ascii="Calibri" w:hAnsi="Calibri"/>
-          <w:sz w:val="20"/>
-        </w:rPr>
-        <w:t xml:space="preserve">  |  </w:t>
-      </w:r>
-      <w:r>
-        <w:rPr>
-          <w:rFonts w:ascii="Calibri" w:hAnsi="Calibri"/>
-          <w:sz w:val="20"/>
-        </w:rPr>
-        <w:t>2021-2023</w:t>
-      </w:r>
-    </w:p>
-    <w:p>
-      <w:pPr>
-        <w:spacing w:before="0" w:after="0"/>
-        <w:ind w:left="360"/>
-      </w:pPr>
-      <w:r>
-        <w:rPr>
-          <w:rFonts w:ascii="Calibri" w:hAnsi="Calibri"/>
-          <w:sz w:val="20"/>
-        </w:rPr>
-        <w:t>•  Led cross-functional program management for submarine flight-critical hardware testing programs, managing team of 5 technicians and 3 junior engineers with full accountability for deliverables and stakeholder coordination</w:t>
-      </w:r>
-    </w:p>
-    <w:p>
-      <w:pPr>
-        <w:spacing w:before="0" w:after="0"/>
-        <w:ind w:left="360"/>
-      </w:pPr>
-      <w:r>
-        <w:rPr>
-          <w:rFonts w:ascii="Calibri" w:hAnsi="Calibri"/>
-          <w:sz w:val="20"/>
-        </w:rPr>
-        <w:t>•  Executed enterprise-scale qualification testing program for Columbia-class submarine flight-critical hardware, ensuring governance compliance with MIL-STD requirements across complex multi-stakeholder environment</w:t>
-      </w:r>
-    </w:p>
-    <w:p>
-      <w:pPr>
-        <w:spacing w:before="0" w:after="0"/>
-        <w:ind w:left="360"/>
-      </w:pPr>
-      <w:r>
-        <w:rPr>
-          <w:rFonts w:ascii="Calibri" w:hAnsi="Calibri"/>
-          <w:sz w:val="20"/>
-        </w:rPr>
-        <w:t>•  Designed and implemented process improvement initiatives saving the US Navy $2M in testing and qualification costs through operating model optimization and risk mitigation strategies</w:t>
-      </w:r>
-    </w:p>
-    <w:p>
-      <w:pPr>
-        <w:spacing w:before="0" w:after="0"/>
-        <w:ind w:left="360"/>
-      </w:pPr>
-      <w:r>
-        <w:rPr>
-          <w:rFonts w:ascii="Calibri" w:hAnsi="Calibri"/>
-          <w:sz w:val="20"/>
-        </w:rPr>
-        <w:t>•  Received executive leadership commendation for delivering hardware testbed Mk. IV program ahead of schedule and under budget through disciplined program management and stakeholder alignment</w:t>
-      </w:r>
-    </w:p>
-    <w:p>
-      <w:pPr>
-        <w:spacing w:before="80" w:after="0"/>
-      </w:pPr>
-      <w:r>
-        <w:rPr>
-          <w:rFonts w:ascii="Calibri" w:hAnsi="Calibri"/>
-          <w:b/>
-          <w:sz w:val="20"/>
-        </w:rPr>
-        <w:t>MIT Lincoln Laboratory - Embedded Software Engineer</w:t>
-      </w:r>
-      <w:r>
-        <w:rPr>
-          <w:rFonts w:ascii="Calibri" w:hAnsi="Calibri"/>
-          <w:sz w:val="20"/>
-        </w:rPr>
-        <w:t xml:space="preserve">  |  </w:t>
-      </w:r>
-      <w:r>
-        <w:rPr>
-          <w:rFonts w:ascii="Calibri" w:hAnsi="Calibri"/>
-          <w:sz w:val="20"/>
-        </w:rPr>
-        <w:t>2023-2025</w:t>
-      </w:r>
-    </w:p>
-    <w:p>
-      <w:pPr>
-        <w:spacing w:before="0" w:after="0"/>
-        <w:ind w:left="360"/>
-      </w:pPr>
-      <w:r>
-        <w:rPr>
-          <w:rFonts w:ascii="Calibri" w:hAnsi="Calibri"/>
-          <w:sz w:val="20"/>
-        </w:rPr>
-        <w:t>•  Led embedded software development portfolio for $100M Army RADAR modernization program, coordinating cross-functional execution across next-generation phased array systems with full program accountability</w:t>
-      </w:r>
-    </w:p>
-    <w:p>
-      <w:pPr>
-        <w:spacing w:before="0" w:after="0"/>
-        <w:ind w:left="360"/>
-      </w:pPr>
-      <w:r>
-        <w:rPr>
-          <w:rFonts w:ascii="Calibri" w:hAnsi="Calibri"/>
-          <w:sz w:val="20"/>
-        </w:rPr>
-        <w:t>•  Architected hardware-in-the-loop test platform bridging C++ firmware to Python data pipeline, enabling automated regression testing across 200+ test cases through systematic process design</w:t>
-      </w:r>
-    </w:p>
-    <w:p>
-      <w:pPr>
-        <w:spacing w:before="0" w:after="0"/>
-        <w:ind w:left="360"/>
-      </w:pPr>
-      <w:r>
-        <w:rPr>
-          <w:rFonts w:ascii="Calibri" w:hAnsi="Calibri"/>
-          <w:sz w:val="20"/>
-        </w:rPr>
-        <w:t>•  Successfully deployed software to Reagan Test Site, Kwajalein Atoll for mission-critical RADAR systems in operational DoD environment, ensuring governance compliance and stakeholder satisfaction</w:t>
-      </w:r>
-    </w:p>
-    <w:p>
-      <w:pPr>
-        <w:spacing w:before="0" w:after="0"/>
-        <w:ind w:left="360"/>
-      </w:pPr>
-      <w:r>
-        <w:rPr>
-          <w:rFonts w:ascii="Calibri" w:hAnsi="Calibri"/>
-          <w:sz w:val="20"/>
-        </w:rPr>
-        <w:t>•  Implemented arbitrary waveform generation algorithms for RADAR phased array beam steering, optimizing signal fidelity for multi-target tracking</w:t>
-      </w:r>
-    </w:p>
-    <w:p>
-      <w:pPr>
-        <w:spacing w:before="80" w:after="0"/>
-      </w:pPr>
-      <w:r>
-        <w:rPr>
-          <w:rFonts w:ascii="Calibri" w:hAnsi="Calibri"/>
-          <w:b/>
-          <w:sz w:val="20"/>
-        </w:rPr>
-        <w:t>Gauntlet-42 LLC - Cofounder</w:t>
-      </w:r>
-      <w:r>
-        <w:rPr>
-          <w:rFonts w:ascii="Calibri" w:hAnsi="Calibri"/>
-          <w:sz w:val="20"/>
-        </w:rPr>
-        <w:t xml:space="preserve">  |  </w:t>
-      </w:r>
-      <w:r>
-        <w:rPr>
-          <w:rFonts w:ascii="Calibri" w:hAnsi="Calibri"/>
-          <w:sz w:val="20"/>
-        </w:rPr>
-        <w:t>2022-Present</w:t>
-      </w:r>
-    </w:p>
-    <w:p>
-      <w:pPr>
-        <w:spacing w:before="0" w:after="0"/>
-        <w:ind w:left="360"/>
-      </w:pPr>
-      <w:r>
-        <w:rPr>
-          <w:rFonts w:ascii="Calibri" w:hAnsi="Calibri"/>
-          <w:sz w:val="20"/>
-        </w:rPr>
-        <w:t>•  Built and scaled 3-person engineering team with zero turnover across 3+ years, establishing operating model, governance frameworks, and capability development processes for sustained organizational growth</w:t>
-      </w:r>
-    </w:p>
-    <w:p>
-      <w:pPr>
-        <w:spacing w:before="0" w:after="0"/>
-        <w:ind w:left="360"/>
-      </w:pPr>
-      <w:r>
-        <w:rPr>
-          <w:rFonts w:ascii="Calibri" w:hAnsi="Calibri"/>
-          <w:sz w:val="20"/>
-        </w:rPr>
-        <w:t>•  Led end-to-end program management for Spyglass AI-native automated public-records researcher, coordinating cross-functional development of OCR, NLP/LLM extraction, and recursive orchestration pipeline</w:t>
-      </w:r>
-    </w:p>
-    <w:p>
-      <w:pPr>
-        <w:spacing w:before="0" w:after="0"/>
-        <w:ind w:left="360"/>
-      </w:pPr>
-      <w:r>
-        <w:rPr>
-          <w:rFonts w:ascii="Calibri" w:hAnsi="Calibri"/>
-          <w:sz w:val="20"/>
-        </w:rPr>
-        <w:t>•  Designed enterprise-scale OCR to NLP/LLM extraction to recursive orchestration pipeline processing thousands of public records with &lt;2% error rate through systematic quality governance and risk management</w:t>
-      </w:r>
-    </w:p>
-    <w:p>
-      <w:pPr>
-        <w:spacing w:before="80" w:after="0"/>
-      </w:pPr>
-      <w:r>
-        <w:rPr>
-          <w:rFonts w:ascii="Calibri" w:hAnsi="Calibri"/>
-          <w:b/>
-          <w:sz w:val="20"/>
-        </w:rPr>
-        <w:t>MIT Sloan Action Learning - Team Lead</w:t>
-      </w:r>
-      <w:r>
-        <w:rPr>
-          <w:rFonts w:ascii="Calibri" w:hAnsi="Calibri"/>
-          <w:sz w:val="20"/>
-        </w:rPr>
-        <w:t xml:space="preserve">  |  </w:t>
-      </w:r>
-      <w:r>
-        <w:rPr>
-          <w:rFonts w:ascii="Calibri" w:hAnsi="Calibri"/>
-          <w:sz w:val="20"/>
-        </w:rPr>
-        <w:t>2025-2026</w:t>
-      </w:r>
-    </w:p>
-    <w:p>
-      <w:pPr>
-        <w:spacing w:before="0" w:after="0"/>
-        <w:ind w:left="360"/>
-      </w:pPr>
-      <w:r>
-        <w:rPr>
-          <w:rFonts w:ascii="Calibri" w:hAnsi="Calibri"/>
-          <w:sz w:val="20"/>
-        </w:rPr>
-        <w:t>•  Led cross-functional GTM strategy and technical requirements definition for EMR data product at Helium Health, coordinating stakeholder integration across international operations in Nairobi</w:t>
-      </w:r>
-    </w:p>
-    <w:p>
-      <w:pPr>
-        <w:spacing w:before="0" w:after="0"/>
-        <w:ind w:left="360"/>
-      </w:pPr>
-      <w:r>
-        <w:rPr>
-          <w:rFonts w:ascii="Calibri" w:hAnsi="Calibri"/>
-          <w:sz w:val="20"/>
-        </w:rPr>
-        <w:t>•  Built genAI analytics MVP detecting discrimination patterns across 10K+ court documents for ICAAD international human rights NGO, managing program delivery and stakeholder communication</w:t>
-      </w:r>
-    </w:p>
-    <w:p>
-      <w:pPr>
-        <w:spacing w:before="160" w:after="40"/>
-        <w:pBdr>
-          <w:bottom w:val="single" w:sz="4" w:space="1" w:color="333333"/>
-        </w:pBdr>
-      </w:pPr>
-      <w:r>
-        <w:rPr>
-          <w:rFonts w:ascii="Calibri" w:hAnsi="Calibri"/>
-          <w:b/>
-          <w:sz w:val="22"/>
-        </w:rPr>
-        <w:t>EDUCATION</w:t>
-      </w:r>
-    </w:p>
-    <w:p>
-      <w:pPr>
-        <w:spacing w:before="80" w:after="0"/>
-      </w:pPr>
-      <w:r>
-        <w:rPr>
-          <w:rFonts w:ascii="Calibri" w:hAnsi="Calibri"/>
-          <w:b/>
-          <w:sz w:val="20"/>
-        </w:rPr>
-        <w:t>MIT Sloan School of Management - MBA</w:t>
-      </w:r>
-      <w:r>
-        <w:rPr>
-          <w:rFonts w:ascii="Calibri" w:hAnsi="Calibri"/>
-          <w:sz w:val="20"/>
-        </w:rPr>
-        <w:t xml:space="preserve">  |  </w:t>
-      </w:r>
-      <w:r>
-        <w:rPr>
-          <w:rFonts w:ascii="Calibri" w:hAnsi="Calibri"/>
-          <w:sz w:val="20"/>
-        </w:rPr>
-        <w:t>May 2026 | GPA: 4.0</w:t>
-      </w:r>
-    </w:p>
-    <w:p>
-      <w:pPr>
-        <w:spacing w:before="0" w:after="0"/>
-        <w:ind w:left="360"/>
-      </w:pPr>
-      <w:r>
-        <w:rPr>
-          <w:rFonts w:ascii="Calibri" w:hAnsi="Calibri"/>
-          <w:sz w:val="20"/>
-        </w:rPr>
-        <w:t>•  GenAI Lab project lead, built LLM-powered analytics tools for enterprise research workflows, coordinating cross-functional development and stakeholder requirements definition</w:t>
-      </w:r>
-    </w:p>
-    <w:p>
-      <w:pPr>
-        <w:spacing w:before="0" w:after="0"/>
-        <w:ind w:left="360"/>
-      </w:pPr>
-      <w:r>
-        <w:rPr>
-          <w:rFonts w:ascii="Calibri" w:hAnsi="Calibri"/>
-          <w:sz w:val="20"/>
-        </w:rPr>
-        <w:t>•  Cross-registered Nuclear Science &amp; Engineering - reactor physics, systems design</w:t>
-      </w:r>
-    </w:p>
-    <w:p>
-      <w:pPr>
-        <w:spacing w:before="80" w:after="0"/>
-      </w:pPr>
-      <w:r>
-        <w:rPr>
-          <w:rFonts w:ascii="Calibri" w:hAnsi="Calibri"/>
-          <w:b/>
-          <w:sz w:val="20"/>
-        </w:rPr>
-        <w:t>University of Connecticut - BS Computer Engineering, BS Electrical Engineering, BA Computer Science; Minor in Mathematics</w:t>
-      </w:r>
-      <w:r>
-        <w:rPr>
-          <w:rFonts w:ascii="Calibri" w:hAnsi="Calibri"/>
-          <w:sz w:val="20"/>
-        </w:rPr>
-        <w:t xml:space="preserve">  |  </w:t>
-      </w:r>
-      <w:r>
-        <w:rPr>
-          <w:rFonts w:ascii="Calibri" w:hAnsi="Calibri"/>
-          <w:sz w:val="20"/>
-        </w:rPr>
-        <w:t>2021 | GPA: 3.429</w:t>
-      </w:r>
-    </w:p>
-    <w:p>
-      <w:pPr>
-        <w:spacing w:before="0" w:after="0"/>
-        <w:ind w:left="360"/>
-      </w:pPr>
-      <w:r>
-        <w:rPr>
-          <w:rFonts w:ascii="Calibri" w:hAnsi="Calibri"/>
-          <w:sz w:val="20"/>
-        </w:rPr>
-        <w:t>•  Naval Science &amp; Technology sub-plan - submarine systems, naval architecture fundamentals</w:t>
-      </w:r>
-    </w:p>
-    <w:p>
-      <w:pPr>
-        <w:spacing w:before="0" w:after="0"/>
-        <w:ind w:left="360"/>
-      </w:pPr>
-      <w:r>
-        <w:rPr>
-          <w:rFonts w:ascii="Calibri" w:hAnsi="Calibri"/>
-          <w:sz w:val="20"/>
-        </w:rPr>
-        <w:t>•  LSTM time-series prediction research on near-surface wave and wake forces for simulated hydrofoils, modeling how submarine wake signatures become more detectable near the surface</w:t>
-      </w:r>
-    </w:p>
-    <w:p>
-      <w:pPr>
-        <w:spacing w:before="160" w:after="40"/>
-        <w:pBdr>
-          <w:bottom w:val="single" w:sz="4" w:space="1" w:color="333333"/>
-        </w:pBdr>
-      </w:pPr>
-      <w:r>
-        <w:rPr>
-          <w:rFonts w:ascii="Calibri" w:hAnsi="Calibri"/>
-          <w:b/>
-          <w:sz w:val="22"/>
-        </w:rPr>
-        <w:t>TECHNICAL SKILLS</w:t>
-      </w:r>
-    </w:p>
-    <w:p>
-      <w:pPr>
-        <w:spacing w:before="20" w:after="20"/>
-      </w:pPr>
-      <w:r>
-        <w:rPr>
-          <w:rFonts w:ascii="Calibri" w:hAnsi="Calibri"/>
-          <w:sz w:val="20"/>
-        </w:rPr>
-        <w:t>Program Management Office (PMO), Cross-functional Leadership, Portfolio Management, Operating Model Design, Stakeholder Management, Enterprise Program Management, Governance &amp; Compliance, Python, Defense Systems, Change Management</w:t>
-      </w:r>
-    </w:p>
     <w:sectPr>
       <w:pgSz w:w="12240" w:h="15840"/>
-      <w:pgMar w:top="720" w:right="864" w:bottom="720" w:left="864" w:header="720" w:footer="720" w:gutter="0"/>
+      <w:pgMar w:top="720" w:right="936" w:bottom="720" w:left="936" w:header="720" w:footer="720" w:gutter="0"/>
       <w:cols w:space="720"/>
       <w:docGrid w:linePitch="360"/>
     </w:sectPr>
@@ -725,6 +1287,20 @@
   <w:num w:numId="9">
     <w:abstractNumId w:val="0"/>
   </w:num>
+  <w:abstractNum w:abstractNumId="0">
+    <w:lvl w:ilvl="0">
+      <w:start w:val="1"/>
+      <w:numFmt w:val="bullet"/>
+      <w:lvlText w:val="•"/>
+      <w:lvlJc w:val="left"/>
+      <w:rPr>
+        <w:rFonts w:ascii="Symbol" w:hAnsi="Symbol" w:hint="default"/>
+      </w:rPr>
+    </w:lvl>
+  </w:abstractNum>
+  <w:num w:numId="1">
+    <w:abstractNumId w:val="0"/>
+  </w:num>
 </w:numbering>
 </file>
 
@@ -733,7 +1309,7 @@
   <w:docDefaults>
     <w:rPrDefault>
       <w:rPr>
-        <w:rFonts w:asciiTheme="minorHAnsi" w:eastAsiaTheme="minorEastAsia" w:hAnsiTheme="minorHAnsi" w:cstheme="minorBidi"/>
+        <w:rFonts w:asciiTheme="minorHAnsi" w:eastAsiaTheme="minorEastAsia" w:hAnsiTheme="minorHAnsi" w:cstheme="minorBidi" w:ascii="Times New Roman" w:hAnsi="Times New Roman" w:eastAsia="Times New Roman" w:cs="Times New Roman"/>
         <w:sz w:val="22"/>
         <w:szCs w:val="22"/>
         <w:lang w:val="en-US" w:eastAsia="en-US" w:bidi="ar-SA"/>

</xml_diff>